<commit_message>
depin: Hexaspot 사람 창구 Tobias Klaver — 맞춤 InMail · 보고서 주석
Co-Authored-By: Claude Opus 5.5 <noreply@anthropic.com>
Claude-Session: https://claude.ai/code/session_014drgzQYBXTLjd1zzmsjRaS
</commit_message>
<xml_diff>
--- a/reports/WeatherXM 유럽 유통사 심층 조사.docx
+++ b/reports/WeatherXM 유럽 유통사 심층 조사.docx
@@ -9645,6 +9645,58 @@
           <w:sz w:val="20"/>
           <w:szCs w:val="20"/>
         </w:rPr>
+        <w:t xml:space="preserve">&gt; </w:t>
+      </w:r>
+      <w:r>
+        <w:rPr>
+          <w:rFonts w:ascii="Malgun Gothic" w:hAnsi="Malgun Gothic" w:eastAsia="Malgun Gothic" w:cs="Malgun Gothic"/>
+          <w:b/>
+          <w:bCs/>
+          <w:color w:val="1B1B48"/>
+          <w:sz w:val="20"/>
+          <w:szCs w:val="20"/>
+        </w:rPr>
+        <w:t xml:space="preserve">10/10 추가</w:t>
+      </w:r>
+      <w:r>
+        <w:rPr>
+          <w:rFonts w:ascii="Malgun Gothic" w:hAnsi="Malgun Gothic" w:eastAsia="Malgun Gothic" w:cs="Malgun Gothic"/>
+          <w:color w:val="1B1B48"/>
+          <w:sz w:val="20"/>
+          <w:szCs w:val="20"/>
+        </w:rPr>
+        <w:t xml:space="preserve"> — 사람 창구를 찾았다: Tobias Klaver(영업 매니저 2023-11~, 2021-07~2025-10 소유주, Connect IoT · Trackpac 엔지니어). 링크드인으로 직접 보낸다(그에게 맞춘 판은 </w:t>
+      </w:r>
+      <w:r>
+        <w:rPr>
+          <w:rFonts w:ascii="Malgun Gothic" w:hAnsi="Malgun Gothic" w:eastAsia="Malgun Gothic" w:cs="Malgun Gothic"/>
+          <w:color w:val="6B6B8C"/>
+          <w:sz w:val="20"/>
+          <w:szCs w:val="20"/>
+        </w:rPr>
+        <w:t xml:space="preserve">depin/intel/business-directions.md</w:t>
+      </w:r>
+      <w:r>
+        <w:rPr>
+          <w:rFonts w:ascii="Malgun Gothic" w:hAnsi="Malgun Gothic" w:eastAsia="Malgun Gothic" w:cs="Malgun Gothic"/>
+          <w:color w:val="1B1B48"/>
+          <w:sz w:val="20"/>
+          <w:szCs w:val="20"/>
+        </w:rPr>
+        <w:t xml:space="preserve"> 「Tobias Klaver」 절). 아래 공용 창구 판은 그가 답이 없을 때 쓴다.</w:t>
+      </w:r>
+    </w:p>
+    <w:p>
+      <w:pPr>
+        <w:spacing w:after="140" w:line="320" w:lineRule="exact"/>
+      </w:pPr>
+      <w:r>
+        <w:rPr>
+          <w:rFonts w:ascii="Malgun Gothic" w:hAnsi="Malgun Gothic" w:eastAsia="Malgun Gothic" w:cs="Malgun Gothic"/>
+          <w:color w:val="1B1B48"/>
+          <w:sz w:val="20"/>
+          <w:szCs w:val="20"/>
+        </w:rPr>
         <w:t xml:space="preserve">받는 곳: 사이트 Contact Us 의 공용 지원 메일. 본문에 "기업 영업(Business Sales) 담당께 전달 부탁" 한 줄이 이미 들어 있다. B2B 견적 · LoRaWAN · WS2000 이 각도다.</w:t>
       </w:r>
     </w:p>

</xml_diff>

<commit_message>
depin: HeliumDeploy 사람 창구 Rory Bokser — 짧은 InMail · 보고서 주석
Co-Authored-By: Claude Opus 5.5 <noreply@anthropic.com>
Claude-Session: https://claude.ai/code/session_014drgzQYBXTLjd1zzmsjRaS
</commit_message>
<xml_diff>
--- a/reports/WeatherXM 유럽 유통사 심층 조사.docx
+++ b/reports/WeatherXM 유럽 유통사 심층 조사.docx
@@ -11181,6 +11181,58 @@
           <w:sz w:val="20"/>
           <w:szCs w:val="20"/>
         </w:rPr>
+        <w:t xml:space="preserve">&gt; </w:t>
+      </w:r>
+      <w:r>
+        <w:rPr>
+          <w:rFonts w:ascii="Malgun Gothic" w:hAnsi="Malgun Gothic" w:eastAsia="Malgun Gothic" w:cs="Malgun Gothic"/>
+          <w:b/>
+          <w:bCs/>
+          <w:color w:val="1B1B48"/>
+          <w:sz w:val="20"/>
+          <w:szCs w:val="20"/>
+        </w:rPr>
+        <w:t xml:space="preserve">10/10 추가</w:t>
+      </w:r>
+      <w:r>
+        <w:rPr>
+          <w:rFonts w:ascii="Malgun Gothic" w:hAnsi="Malgun Gothic" w:eastAsia="Malgun Gothic" w:cs="Malgun Gothic"/>
+          <w:color w:val="1B1B48"/>
+          <w:sz w:val="20"/>
+          <w:szCs w:val="20"/>
+        </w:rPr>
+        <w:t xml:space="preserve"> — 사람 창구: Rory Bokser(공동창업자 · Head of Product, 몬트리올). 짧은 InMail 을 먼저 보내고 제조사 창구는 병행(문안은 </w:t>
+      </w:r>
+      <w:r>
+        <w:rPr>
+          <w:rFonts w:ascii="Malgun Gothic" w:hAnsi="Malgun Gothic" w:eastAsia="Malgun Gothic" w:cs="Malgun Gothic"/>
+          <w:color w:val="6B6B8C"/>
+          <w:sz w:val="20"/>
+          <w:szCs w:val="20"/>
+        </w:rPr>
+        <w:t xml:space="preserve">depin/intel/business-directions.md</w:t>
+      </w:r>
+      <w:r>
+        <w:rPr>
+          <w:rFonts w:ascii="Malgun Gothic" w:hAnsi="Malgun Gothic" w:eastAsia="Malgun Gothic" w:cs="Malgun Gothic"/>
+          <w:color w:val="1B1B48"/>
+          <w:sz w:val="20"/>
+          <w:szCs w:val="20"/>
+        </w:rPr>
+        <w:t xml:space="preserve"> 「Rory Bokser」 절).</w:t>
+      </w:r>
+    </w:p>
+    <w:p>
+      <w:pPr>
+        <w:spacing w:after="140" w:line="320" w:lineRule="exact"/>
+      </w:pPr>
+      <w:r>
+        <w:rPr>
+          <w:rFonts w:ascii="Malgun Gothic" w:hAnsi="Malgun Gothic" w:eastAsia="Malgun Gothic" w:cs="Malgun Gothic"/>
+          <w:color w:val="1B1B48"/>
+          <w:sz w:val="20"/>
+          <w:szCs w:val="20"/>
+        </w:rPr>
         <w:t xml:space="preserve">받는 곳: 공개 「For Manufacturers」 페이지 양식. 스펙 시트와 보드 사진을 첨부하고 아래 본문을 메시지 칸에 넣는다. 양식에 글자 수 제한이 있으면 셋째 · 다섯째 문단(숫자 · 유럽)을 남기고 넷째 문단을 줄인다. 이 회사는 퀘벡 회사라 의사결정은 창업자 한두 명이 할 가능성이 크다.</w:t>
       </w:r>
     </w:p>

</xml_diff>

<commit_message>
depin: HeliumDeploy 창구 Abel Solomon(CEO)로 · Rory 예비 · 프리미엄 결제 오류 시 1촌 메모
Co-Authored-By: Claude Opus 5.5 <noreply@anthropic.com>
Claude-Session: https://claude.ai/code/session_014drgzQYBXTLjd1zzmsjRaS
</commit_message>
<xml_diff>
--- a/reports/WeatherXM 유럽 유통사 심층 조사.docx
+++ b/reports/WeatherXM 유럽 유통사 심층 조사.docx
@@ -11201,7 +11201,27 @@
           <w:sz w:val="20"/>
           <w:szCs w:val="20"/>
         </w:rPr>
-        <w:t xml:space="preserve"> — 사람 창구: Rory Bokser(공동창업자 · Head of Product, 몬트리올). 짧은 InMail 을 먼저 보내고 제조사 창구는 병행(문안은 </w:t>
+        <w:t xml:space="preserve"> — 사람 창구: </w:t>
+      </w:r>
+      <w:r>
+        <w:rPr>
+          <w:rFonts w:ascii="Malgun Gothic" w:hAnsi="Malgun Gothic" w:eastAsia="Malgun Gothic" w:cs="Malgun Gothic"/>
+          <w:b/>
+          <w:bCs/>
+          <w:color w:val="1B1B48"/>
+          <w:sz w:val="20"/>
+          <w:szCs w:val="20"/>
+        </w:rPr>
+        <w:t xml:space="preserve">Abel Solomon(CEO 2026-07~ · 공동창업 · 영업 총괄)</w:t>
+      </w:r>
+      <w:r>
+        <w:rPr>
+          <w:rFonts w:ascii="Malgun Gothic" w:hAnsi="Malgun Gothic" w:eastAsia="Malgun Gothic" w:cs="Malgun Gothic"/>
+          <w:color w:val="1B1B48"/>
+          <w:sz w:val="20"/>
+          <w:szCs w:val="20"/>
+        </w:rPr>
+        <w:t xml:space="preserve"> 에게만 보낸다. Rory Bokser(공동창업 · Head of Product)는 예비. 제조사 창구는 병행(문안은 </w:t>
       </w:r>
       <w:r>
         <w:rPr>

</xml_diff>

<commit_message>
depin: Crypship 메일(짧은 판) · Imprint 원문 확인 · Pre TGE 칸 주의
Co-Authored-By: Claude Opus 5.5 <noreply@anthropic.com>
Claude-Session: https://claude.ai/code/session_014drgzQYBXTLjd1zzmsjRaS
</commit_message>
<xml_diff>
--- a/reports/WeatherXM 유럽 유통사 심층 조사.docx
+++ b/reports/WeatherXM 유럽 유통사 심층 조사.docx
@@ -12765,6 +12765,78 @@
           <w:sz w:val="20"/>
           <w:szCs w:val="20"/>
         </w:rPr>
+        <w:t xml:space="preserve">&gt; </w:t>
+      </w:r>
+      <w:r>
+        <w:rPr>
+          <w:rFonts w:ascii="Malgun Gothic" w:hAnsi="Malgun Gothic" w:eastAsia="Malgun Gothic" w:cs="Malgun Gothic"/>
+          <w:b/>
+          <w:bCs/>
+          <w:color w:val="1B1B48"/>
+          <w:sz w:val="20"/>
+          <w:szCs w:val="20"/>
+        </w:rPr>
+        <w:t xml:space="preserve">10/10 추가 — 원문 확인(서우 캡처)</w:t>
+      </w:r>
+      <w:r>
+        <w:rPr>
+          <w:rFonts w:ascii="Malgun Gothic" w:hAnsi="Malgun Gothic" w:eastAsia="Malgun Gothic" w:cs="Malgun Gothic"/>
+          <w:color w:val="1B1B48"/>
+          <w:sz w:val="20"/>
+          <w:szCs w:val="20"/>
+        </w:rPr>
+        <w:t xml:space="preserve">: Imprint = Kansi Solutions GmbH · HRB 107712 · 대표 Jonas Becker · Konstantin Nidens(검색 요약과 일치). 홈의 날씨 선반은 </w:t>
+      </w:r>
+      <w:r>
+        <w:rPr>
+          <w:rFonts w:ascii="Malgun Gothic" w:hAnsi="Malgun Gothic" w:eastAsia="Malgun Gothic" w:cs="Malgun Gothic"/>
+          <w:b/>
+          <w:bCs/>
+          <w:color w:val="1B1B48"/>
+          <w:sz w:val="20"/>
+          <w:szCs w:val="20"/>
+        </w:rPr>
+        <w:t xml:space="preserve">Nubila Marco(299€)</w:t>
+      </w:r>
+      <w:r>
+        <w:rPr>
+          <w:rFonts w:ascii="Malgun Gothic" w:hAnsi="Malgun Gothic" w:eastAsia="Malgun Gothic" w:cs="Malgun Gothic"/>
+          <w:color w:val="1B1B48"/>
+          <w:sz w:val="20"/>
+          <w:szCs w:val="20"/>
+        </w:rPr>
+        <w:t xml:space="preserve"> 이고 「Pre TGE」 칸이 있다. 짧은 판 메일은 </w:t>
+      </w:r>
+      <w:r>
+        <w:rPr>
+          <w:rFonts w:ascii="Malgun Gothic" w:hAnsi="Malgun Gothic" w:eastAsia="Malgun Gothic" w:cs="Malgun Gothic"/>
+          <w:color w:val="6B6B8C"/>
+          <w:sz w:val="20"/>
+          <w:szCs w:val="20"/>
+        </w:rPr>
+        <w:t xml:space="preserve">depin/intel/business-directions.md</w:t>
+      </w:r>
+      <w:r>
+        <w:rPr>
+          <w:rFonts w:ascii="Malgun Gothic" w:hAnsi="Malgun Gothic" w:eastAsia="Malgun Gothic" w:cs="Malgun Gothic"/>
+          <w:color w:val="1B1B48"/>
+          <w:sz w:val="20"/>
+          <w:szCs w:val="20"/>
+        </w:rPr>
+        <w:t xml:space="preserve"> 「Crypship — 메일로」 절.</w:t>
+      </w:r>
+    </w:p>
+    <w:p>
+      <w:pPr>
+        <w:spacing w:after="140" w:line="320" w:lineRule="exact"/>
+      </w:pPr>
+      <w:r>
+        <w:rPr>
+          <w:rFonts w:ascii="Malgun Gothic" w:hAnsi="Malgun Gothic" w:eastAsia="Malgun Gothic" w:cs="Malgun Gothic"/>
+          <w:color w:val="1B1B48"/>
+          <w:sz w:val="20"/>
+          <w:szCs w:val="20"/>
+        </w:rPr>
         <w:t xml:space="preserve">받는 곳: Bulk Orders 양식이나 Support Center 의 공용 지원 메일. 두 대표의 이름은 공개 About · 등기 정보에 있는 그대로 쓴다. 하드웨어 + 데이터(RTKdata), Nubila · SkyX 날씨 선반이 각도다. </w:t>
       </w:r>
       <w:r>

</xml_diff>